<commit_message>
tambah mandatory ubah password jika masih standar
</commit_message>
<xml_diff>
--- a/uploads/template_laporan_led.docx
+++ b/uploads/template_laporan_led.docx
@@ -233,61 +233,22 @@
     </w:p>
     <w:p>
       <w:pPr>
-        <w:spacing w:after="0" w:line="480" w:lineRule="auto"/>
-        <w:jc w:val="center"/>
-        <w:rPr>
-          <w:rFonts w:ascii="Times New Roman" w:hAnsi="Times New Roman"/>
-          <w:b/>
-          <w:bCs/>
-          <w:sz w:val="36"/>
-          <w:szCs w:val="36"/>
-        </w:rPr>
-      </w:pPr>
-    </w:p>
-    <w:p>
-      <w:pPr>
-        <w:spacing w:after="0" w:line="480" w:lineRule="auto"/>
-        <w:jc w:val="center"/>
-        <w:rPr>
-          <w:rFonts w:ascii="Times New Roman" w:hAnsi="Times New Roman"/>
-          <w:b/>
-          <w:bCs/>
-          <w:sz w:val="36"/>
-          <w:szCs w:val="36"/>
-        </w:rPr>
-      </w:pPr>
-    </w:p>
-    <w:p>
-      <w:pPr>
-        <w:spacing w:after="0" w:line="480" w:lineRule="auto"/>
-        <w:jc w:val="center"/>
-        <w:rPr>
-          <w:rFonts w:ascii="Times New Roman" w:hAnsi="Times New Roman"/>
-          <w:b/>
-          <w:bCs/>
-          <w:sz w:val="36"/>
-          <w:szCs w:val="36"/>
-        </w:rPr>
-      </w:pPr>
-    </w:p>
-    <w:p>
-      <w:pPr>
         <w:spacing w:after="0" w:line="240" w:lineRule="auto"/>
         <w:rPr>
           <w:rFonts w:ascii="Times New Roman" w:hAnsi="Times New Roman"/>
           <w:b/>
           <w:bCs/>
-          <w:sz w:val="32"/>
-          <w:szCs w:val="32"/>
-        </w:rPr>
-      </w:pPr>
-      <w:r>
-        <w:rPr>
-          <w:rFonts w:ascii="Times New Roman" w:hAnsi="Times New Roman"/>
-          <w:b/>
-          <w:bCs/>
-          <w:sz w:val="32"/>
-          <w:szCs w:val="32"/>
+          <w:sz w:val="28"/>
+          <w:szCs w:val="28"/>
+        </w:rPr>
+      </w:pPr>
+      <w:r>
+        <w:rPr>
+          <w:rFonts w:ascii="Times New Roman" w:hAnsi="Times New Roman"/>
+          <w:b/>
+          <w:bCs/>
+          <w:sz w:val="28"/>
+          <w:szCs w:val="28"/>
         </w:rPr>
         <w:br w:type="page"/>
       </w:r>
@@ -975,66 +936,6 @@
     </w:tbl>
     <w:p>
       <w:pPr>
-        <w:spacing w:after="0" w:line="480" w:lineRule="auto"/>
-        <w:rPr>
-          <w:rFonts w:ascii="Times New Roman" w:hAnsi="Times New Roman"/>
-          <w:sz w:val="24"/>
-          <w:szCs w:val="24"/>
-        </w:rPr>
-      </w:pPr>
-    </w:p>
-    <w:p>
-      <w:pPr>
-        <w:spacing w:after="0" w:line="480" w:lineRule="auto"/>
-        <w:rPr>
-          <w:rFonts w:ascii="Times New Roman" w:hAnsi="Times New Roman"/>
-          <w:sz w:val="24"/>
-          <w:szCs w:val="24"/>
-        </w:rPr>
-      </w:pPr>
-    </w:p>
-    <w:p>
-      <w:pPr>
-        <w:spacing w:after="0" w:line="480" w:lineRule="auto"/>
-        <w:rPr>
-          <w:rFonts w:ascii="Times New Roman" w:hAnsi="Times New Roman"/>
-          <w:sz w:val="24"/>
-          <w:szCs w:val="24"/>
-        </w:rPr>
-      </w:pPr>
-    </w:p>
-    <w:p>
-      <w:pPr>
-        <w:spacing w:after="0" w:line="480" w:lineRule="auto"/>
-        <w:rPr>
-          <w:rFonts w:ascii="Times New Roman" w:hAnsi="Times New Roman"/>
-          <w:sz w:val="24"/>
-          <w:szCs w:val="24"/>
-        </w:rPr>
-      </w:pPr>
-    </w:p>
-    <w:p>
-      <w:pPr>
-        <w:spacing w:after="0" w:line="480" w:lineRule="auto"/>
-        <w:rPr>
-          <w:rFonts w:ascii="Times New Roman" w:hAnsi="Times New Roman"/>
-          <w:sz w:val="24"/>
-          <w:szCs w:val="24"/>
-        </w:rPr>
-      </w:pPr>
-    </w:p>
-    <w:p>
-      <w:pPr>
-        <w:spacing w:after="0" w:line="480" w:lineRule="auto"/>
-        <w:rPr>
-          <w:rFonts w:ascii="Times New Roman" w:hAnsi="Times New Roman"/>
-          <w:sz w:val="24"/>
-          <w:szCs w:val="24"/>
-        </w:rPr>
-      </w:pPr>
-    </w:p>
-    <w:p>
-      <w:pPr>
         <w:spacing w:after="0" w:line="240" w:lineRule="auto"/>
         <w:rPr>
           <w:rFonts w:ascii="Times New Roman" w:hAnsi="Times New Roman"/>
@@ -1192,166 +1093,6 @@
         </w:rPr>
         <w:t>BAB IV PENUTUP</w:t>
       </w:r>
-    </w:p>
-    <w:p>
-      <w:pPr>
-        <w:spacing w:after="0" w:line="480" w:lineRule="auto"/>
-        <w:rPr>
-          <w:rFonts w:ascii="Times New Roman" w:hAnsi="Times New Roman"/>
-          <w:sz w:val="24"/>
-          <w:szCs w:val="24"/>
-        </w:rPr>
-      </w:pPr>
-    </w:p>
-    <w:p>
-      <w:pPr>
-        <w:spacing w:after="0" w:line="480" w:lineRule="auto"/>
-        <w:rPr>
-          <w:rFonts w:ascii="Times New Roman" w:hAnsi="Times New Roman"/>
-          <w:sz w:val="24"/>
-          <w:szCs w:val="24"/>
-        </w:rPr>
-      </w:pPr>
-    </w:p>
-    <w:p>
-      <w:pPr>
-        <w:spacing w:after="0" w:line="480" w:lineRule="auto"/>
-        <w:rPr>
-          <w:rFonts w:ascii="Times New Roman" w:hAnsi="Times New Roman"/>
-          <w:sz w:val="24"/>
-          <w:szCs w:val="24"/>
-        </w:rPr>
-      </w:pPr>
-    </w:p>
-    <w:p>
-      <w:pPr>
-        <w:spacing w:after="0" w:line="480" w:lineRule="auto"/>
-        <w:rPr>
-          <w:rFonts w:ascii="Times New Roman" w:hAnsi="Times New Roman"/>
-          <w:sz w:val="24"/>
-          <w:szCs w:val="24"/>
-        </w:rPr>
-      </w:pPr>
-    </w:p>
-    <w:p>
-      <w:pPr>
-        <w:spacing w:after="0" w:line="480" w:lineRule="auto"/>
-        <w:rPr>
-          <w:rFonts w:ascii="Times New Roman" w:hAnsi="Times New Roman"/>
-          <w:sz w:val="24"/>
-          <w:szCs w:val="24"/>
-        </w:rPr>
-      </w:pPr>
-    </w:p>
-    <w:p>
-      <w:pPr>
-        <w:spacing w:after="0" w:line="480" w:lineRule="auto"/>
-        <w:rPr>
-          <w:rFonts w:ascii="Times New Roman" w:hAnsi="Times New Roman"/>
-          <w:sz w:val="24"/>
-          <w:szCs w:val="24"/>
-        </w:rPr>
-      </w:pPr>
-    </w:p>
-    <w:p>
-      <w:pPr>
-        <w:spacing w:after="0" w:line="480" w:lineRule="auto"/>
-        <w:rPr>
-          <w:rFonts w:ascii="Times New Roman" w:hAnsi="Times New Roman"/>
-          <w:sz w:val="24"/>
-          <w:szCs w:val="24"/>
-        </w:rPr>
-      </w:pPr>
-    </w:p>
-    <w:p>
-      <w:pPr>
-        <w:spacing w:after="0" w:line="480" w:lineRule="auto"/>
-        <w:rPr>
-          <w:rFonts w:ascii="Times New Roman" w:hAnsi="Times New Roman"/>
-          <w:sz w:val="24"/>
-          <w:szCs w:val="24"/>
-        </w:rPr>
-      </w:pPr>
-    </w:p>
-    <w:p>
-      <w:pPr>
-        <w:spacing w:after="0" w:line="480" w:lineRule="auto"/>
-        <w:rPr>
-          <w:rFonts w:ascii="Times New Roman" w:hAnsi="Times New Roman"/>
-          <w:sz w:val="24"/>
-          <w:szCs w:val="24"/>
-        </w:rPr>
-      </w:pPr>
-    </w:p>
-    <w:p>
-      <w:pPr>
-        <w:spacing w:after="0" w:line="480" w:lineRule="auto"/>
-        <w:rPr>
-          <w:rFonts w:ascii="Times New Roman" w:hAnsi="Times New Roman"/>
-          <w:sz w:val="24"/>
-          <w:szCs w:val="24"/>
-        </w:rPr>
-      </w:pPr>
-    </w:p>
-    <w:p>
-      <w:pPr>
-        <w:spacing w:after="0" w:line="480" w:lineRule="auto"/>
-        <w:rPr>
-          <w:rFonts w:ascii="Times New Roman" w:hAnsi="Times New Roman"/>
-          <w:sz w:val="24"/>
-          <w:szCs w:val="24"/>
-        </w:rPr>
-      </w:pPr>
-    </w:p>
-    <w:p>
-      <w:pPr>
-        <w:spacing w:after="0" w:line="480" w:lineRule="auto"/>
-        <w:rPr>
-          <w:rFonts w:ascii="Times New Roman" w:hAnsi="Times New Roman"/>
-          <w:sz w:val="24"/>
-          <w:szCs w:val="24"/>
-        </w:rPr>
-      </w:pPr>
-    </w:p>
-    <w:p>
-      <w:pPr>
-        <w:spacing w:after="0" w:line="480" w:lineRule="auto"/>
-        <w:rPr>
-          <w:rFonts w:ascii="Times New Roman" w:hAnsi="Times New Roman"/>
-          <w:sz w:val="24"/>
-          <w:szCs w:val="24"/>
-        </w:rPr>
-      </w:pPr>
-    </w:p>
-    <w:p>
-      <w:pPr>
-        <w:spacing w:after="0" w:line="480" w:lineRule="auto"/>
-        <w:rPr>
-          <w:rFonts w:ascii="Times New Roman" w:hAnsi="Times New Roman"/>
-          <w:sz w:val="24"/>
-          <w:szCs w:val="24"/>
-        </w:rPr>
-      </w:pPr>
-    </w:p>
-    <w:p>
-      <w:pPr>
-        <w:spacing w:after="0" w:line="480" w:lineRule="auto"/>
-        <w:rPr>
-          <w:rFonts w:ascii="Times New Roman" w:hAnsi="Times New Roman"/>
-          <w:sz w:val="24"/>
-          <w:szCs w:val="24"/>
-        </w:rPr>
-      </w:pPr>
-    </w:p>
-    <w:p>
-      <w:pPr>
-        <w:spacing w:after="0" w:line="480" w:lineRule="auto"/>
-        <w:rPr>
-          <w:rFonts w:ascii="Times New Roman" w:hAnsi="Times New Roman"/>
-          <w:sz w:val="24"/>
-          <w:szCs w:val="24"/>
-        </w:rPr>
-      </w:pPr>
     </w:p>
     <w:p>
       <w:pPr>
@@ -1798,176 +1539,6 @@
     </w:tbl>
     <w:p>
       <w:pPr>
-        <w:spacing w:after="0" w:line="480" w:lineRule="auto"/>
-        <w:rPr>
-          <w:rFonts w:ascii="Times New Roman" w:hAnsi="Times New Roman"/>
-          <w:sz w:val="24"/>
-          <w:szCs w:val="24"/>
-        </w:rPr>
-      </w:pPr>
-    </w:p>
-    <w:p>
-      <w:pPr>
-        <w:spacing w:after="0" w:line="480" w:lineRule="auto"/>
-        <w:rPr>
-          <w:rFonts w:ascii="Times New Roman" w:hAnsi="Times New Roman"/>
-          <w:sz w:val="24"/>
-          <w:szCs w:val="24"/>
-        </w:rPr>
-      </w:pPr>
-    </w:p>
-    <w:p>
-      <w:pPr>
-        <w:spacing w:after="0" w:line="480" w:lineRule="auto"/>
-        <w:rPr>
-          <w:rFonts w:ascii="Times New Roman" w:hAnsi="Times New Roman"/>
-          <w:sz w:val="24"/>
-          <w:szCs w:val="24"/>
-        </w:rPr>
-      </w:pPr>
-    </w:p>
-    <w:p>
-      <w:pPr>
-        <w:spacing w:after="0" w:line="480" w:lineRule="auto"/>
-        <w:rPr>
-          <w:rFonts w:ascii="Times New Roman" w:hAnsi="Times New Roman"/>
-          <w:sz w:val="24"/>
-          <w:szCs w:val="24"/>
-        </w:rPr>
-      </w:pPr>
-    </w:p>
-    <w:p>
-      <w:pPr>
-        <w:spacing w:after="0" w:line="480" w:lineRule="auto"/>
-        <w:rPr>
-          <w:rFonts w:ascii="Times New Roman" w:hAnsi="Times New Roman"/>
-          <w:sz w:val="24"/>
-          <w:szCs w:val="24"/>
-        </w:rPr>
-      </w:pPr>
-    </w:p>
-    <w:p>
-      <w:pPr>
-        <w:spacing w:after="0" w:line="480" w:lineRule="auto"/>
-        <w:rPr>
-          <w:rFonts w:ascii="Times New Roman" w:hAnsi="Times New Roman"/>
-          <w:sz w:val="24"/>
-          <w:szCs w:val="24"/>
-        </w:rPr>
-      </w:pPr>
-    </w:p>
-    <w:p>
-      <w:pPr>
-        <w:spacing w:after="0" w:line="480" w:lineRule="auto"/>
-        <w:rPr>
-          <w:rFonts w:ascii="Times New Roman" w:hAnsi="Times New Roman"/>
-          <w:sz w:val="24"/>
-          <w:szCs w:val="24"/>
-        </w:rPr>
-      </w:pPr>
-    </w:p>
-    <w:p>
-      <w:pPr>
-        <w:spacing w:after="0" w:line="480" w:lineRule="auto"/>
-        <w:rPr>
-          <w:rFonts w:ascii="Times New Roman" w:hAnsi="Times New Roman"/>
-          <w:sz w:val="24"/>
-          <w:szCs w:val="24"/>
-        </w:rPr>
-      </w:pPr>
-    </w:p>
-    <w:p>
-      <w:pPr>
-        <w:spacing w:after="0" w:line="480" w:lineRule="auto"/>
-        <w:rPr>
-          <w:rFonts w:ascii="Times New Roman" w:hAnsi="Times New Roman"/>
-          <w:sz w:val="24"/>
-          <w:szCs w:val="24"/>
-        </w:rPr>
-      </w:pPr>
-    </w:p>
-    <w:p>
-      <w:pPr>
-        <w:spacing w:after="0" w:line="480" w:lineRule="auto"/>
-        <w:rPr>
-          <w:rFonts w:ascii="Times New Roman" w:hAnsi="Times New Roman"/>
-          <w:sz w:val="24"/>
-          <w:szCs w:val="24"/>
-        </w:rPr>
-      </w:pPr>
-    </w:p>
-    <w:p>
-      <w:pPr>
-        <w:spacing w:after="0" w:line="480" w:lineRule="auto"/>
-        <w:rPr>
-          <w:rFonts w:ascii="Times New Roman" w:hAnsi="Times New Roman"/>
-          <w:sz w:val="24"/>
-          <w:szCs w:val="24"/>
-        </w:rPr>
-      </w:pPr>
-    </w:p>
-    <w:p>
-      <w:pPr>
-        <w:spacing w:after="0" w:line="480" w:lineRule="auto"/>
-        <w:rPr>
-          <w:rFonts w:ascii="Times New Roman" w:hAnsi="Times New Roman"/>
-          <w:sz w:val="24"/>
-          <w:szCs w:val="24"/>
-        </w:rPr>
-      </w:pPr>
-    </w:p>
-    <w:p>
-      <w:pPr>
-        <w:spacing w:after="0" w:line="480" w:lineRule="auto"/>
-        <w:rPr>
-          <w:rFonts w:ascii="Times New Roman" w:hAnsi="Times New Roman"/>
-          <w:sz w:val="24"/>
-          <w:szCs w:val="24"/>
-        </w:rPr>
-      </w:pPr>
-    </w:p>
-    <w:p>
-      <w:pPr>
-        <w:spacing w:after="0" w:line="480" w:lineRule="auto"/>
-        <w:rPr>
-          <w:rFonts w:ascii="Times New Roman" w:hAnsi="Times New Roman"/>
-          <w:sz w:val="24"/>
-          <w:szCs w:val="24"/>
-        </w:rPr>
-      </w:pPr>
-    </w:p>
-    <w:p>
-      <w:pPr>
-        <w:spacing w:after="0" w:line="480" w:lineRule="auto"/>
-        <w:rPr>
-          <w:rFonts w:ascii="Times New Roman" w:hAnsi="Times New Roman"/>
-          <w:sz w:val="24"/>
-          <w:szCs w:val="24"/>
-        </w:rPr>
-      </w:pPr>
-    </w:p>
-    <w:p>
-      <w:pPr>
-        <w:spacing w:after="0" w:line="480" w:lineRule="auto"/>
-        <w:rPr>
-          <w:rFonts w:ascii="Times New Roman" w:hAnsi="Times New Roman"/>
-          <w:sz w:val="24"/>
-          <w:szCs w:val="24"/>
-        </w:rPr>
-      </w:pPr>
-    </w:p>
-    <w:p>
-      <w:pPr>
-        <w:spacing w:after="0" w:line="480" w:lineRule="auto"/>
-        <w:rPr>
-          <w:rFonts w:ascii="Times New Roman" w:hAnsi="Times New Roman"/>
-          <w:sz w:val="24"/>
-          <w:szCs w:val="24"/>
-        </w:rPr>
-      </w:pPr>
-    </w:p>
-    <w:p>
-      <w:pPr>
         <w:spacing w:after="0" w:line="240" w:lineRule="auto"/>
         <w:rPr>
           <w:rFonts w:ascii="Times New Roman" w:hAnsi="Times New Roman"/>
@@ -2189,166 +1760,6 @@
     </w:p>
     <w:p>
       <w:pPr>
-        <w:spacing w:after="0" w:line="480" w:lineRule="auto"/>
-        <w:rPr>
-          <w:rFonts w:ascii="Times New Roman" w:hAnsi="Times New Roman"/>
-          <w:sz w:val="24"/>
-          <w:szCs w:val="24"/>
-        </w:rPr>
-      </w:pPr>
-    </w:p>
-    <w:p>
-      <w:pPr>
-        <w:spacing w:after="0" w:line="480" w:lineRule="auto"/>
-        <w:rPr>
-          <w:rFonts w:ascii="Times New Roman" w:hAnsi="Times New Roman"/>
-          <w:sz w:val="24"/>
-          <w:szCs w:val="24"/>
-        </w:rPr>
-      </w:pPr>
-    </w:p>
-    <w:p>
-      <w:pPr>
-        <w:spacing w:after="0" w:line="480" w:lineRule="auto"/>
-        <w:rPr>
-          <w:rFonts w:ascii="Times New Roman" w:hAnsi="Times New Roman"/>
-          <w:sz w:val="24"/>
-          <w:szCs w:val="24"/>
-        </w:rPr>
-      </w:pPr>
-    </w:p>
-    <w:p>
-      <w:pPr>
-        <w:spacing w:after="0" w:line="480" w:lineRule="auto"/>
-        <w:rPr>
-          <w:rFonts w:ascii="Times New Roman" w:hAnsi="Times New Roman"/>
-          <w:sz w:val="24"/>
-          <w:szCs w:val="24"/>
-        </w:rPr>
-      </w:pPr>
-    </w:p>
-    <w:p>
-      <w:pPr>
-        <w:spacing w:after="0" w:line="480" w:lineRule="auto"/>
-        <w:rPr>
-          <w:rFonts w:ascii="Times New Roman" w:hAnsi="Times New Roman"/>
-          <w:sz w:val="24"/>
-          <w:szCs w:val="24"/>
-        </w:rPr>
-      </w:pPr>
-    </w:p>
-    <w:p>
-      <w:pPr>
-        <w:spacing w:after="0" w:line="480" w:lineRule="auto"/>
-        <w:rPr>
-          <w:rFonts w:ascii="Times New Roman" w:hAnsi="Times New Roman"/>
-          <w:sz w:val="24"/>
-          <w:szCs w:val="24"/>
-        </w:rPr>
-      </w:pPr>
-    </w:p>
-    <w:p>
-      <w:pPr>
-        <w:spacing w:after="0" w:line="480" w:lineRule="auto"/>
-        <w:rPr>
-          <w:rFonts w:ascii="Times New Roman" w:hAnsi="Times New Roman"/>
-          <w:sz w:val="24"/>
-          <w:szCs w:val="24"/>
-        </w:rPr>
-      </w:pPr>
-    </w:p>
-    <w:p>
-      <w:pPr>
-        <w:spacing w:after="0" w:line="480" w:lineRule="auto"/>
-        <w:rPr>
-          <w:rFonts w:ascii="Times New Roman" w:hAnsi="Times New Roman"/>
-          <w:sz w:val="24"/>
-          <w:szCs w:val="24"/>
-        </w:rPr>
-      </w:pPr>
-    </w:p>
-    <w:p>
-      <w:pPr>
-        <w:spacing w:after="0" w:line="480" w:lineRule="auto"/>
-        <w:rPr>
-          <w:rFonts w:ascii="Times New Roman" w:hAnsi="Times New Roman"/>
-          <w:sz w:val="24"/>
-          <w:szCs w:val="24"/>
-        </w:rPr>
-      </w:pPr>
-    </w:p>
-    <w:p>
-      <w:pPr>
-        <w:spacing w:after="0" w:line="480" w:lineRule="auto"/>
-        <w:rPr>
-          <w:rFonts w:ascii="Times New Roman" w:hAnsi="Times New Roman"/>
-          <w:sz w:val="24"/>
-          <w:szCs w:val="24"/>
-        </w:rPr>
-      </w:pPr>
-    </w:p>
-    <w:p>
-      <w:pPr>
-        <w:spacing w:after="0" w:line="480" w:lineRule="auto"/>
-        <w:rPr>
-          <w:rFonts w:ascii="Times New Roman" w:hAnsi="Times New Roman"/>
-          <w:sz w:val="24"/>
-          <w:szCs w:val="24"/>
-        </w:rPr>
-      </w:pPr>
-    </w:p>
-    <w:p>
-      <w:pPr>
-        <w:spacing w:after="0" w:line="480" w:lineRule="auto"/>
-        <w:rPr>
-          <w:rFonts w:ascii="Times New Roman" w:hAnsi="Times New Roman"/>
-          <w:sz w:val="24"/>
-          <w:szCs w:val="24"/>
-        </w:rPr>
-      </w:pPr>
-    </w:p>
-    <w:p>
-      <w:pPr>
-        <w:spacing w:after="0" w:line="480" w:lineRule="auto"/>
-        <w:rPr>
-          <w:rFonts w:ascii="Times New Roman" w:hAnsi="Times New Roman"/>
-          <w:sz w:val="24"/>
-          <w:szCs w:val="24"/>
-        </w:rPr>
-      </w:pPr>
-    </w:p>
-    <w:p>
-      <w:pPr>
-        <w:spacing w:after="0" w:line="480" w:lineRule="auto"/>
-        <w:rPr>
-          <w:rFonts w:ascii="Times New Roman" w:hAnsi="Times New Roman"/>
-          <w:sz w:val="24"/>
-          <w:szCs w:val="24"/>
-        </w:rPr>
-      </w:pPr>
-    </w:p>
-    <w:p>
-      <w:pPr>
-        <w:spacing w:after="0" w:line="480" w:lineRule="auto"/>
-        <w:rPr>
-          <w:rFonts w:ascii="Times New Roman" w:hAnsi="Times New Roman"/>
-          <w:sz w:val="24"/>
-          <w:szCs w:val="24"/>
-        </w:rPr>
-      </w:pPr>
-    </w:p>
-    <w:p>
-      <w:pPr>
-        <w:spacing w:after="0" w:line="480" w:lineRule="auto"/>
-        <w:rPr>
-          <w:rFonts w:ascii="Times New Roman" w:hAnsi="Times New Roman"/>
-          <w:sz w:val="24"/>
-          <w:szCs w:val="24"/>
-        </w:rPr>
-      </w:pPr>
-    </w:p>
-    <w:p>
-      <w:pPr>
         <w:spacing w:after="0" w:line="240" w:lineRule="auto"/>
         <w:rPr>
           <w:rFonts w:ascii="Times New Roman" w:hAnsi="Times New Roman"/>
@@ -2490,196 +1901,6 @@
         </w:rPr>
         <w:t>}</w:t>
       </w:r>
-    </w:p>
-    <w:p>
-      <w:pPr>
-        <w:spacing w:after="0" w:line="480" w:lineRule="auto"/>
-        <w:rPr>
-          <w:rFonts w:ascii="Times New Roman" w:hAnsi="Times New Roman"/>
-          <w:sz w:val="24"/>
-          <w:szCs w:val="24"/>
-        </w:rPr>
-      </w:pPr>
-    </w:p>
-    <w:p>
-      <w:pPr>
-        <w:spacing w:after="0" w:line="480" w:lineRule="auto"/>
-        <w:rPr>
-          <w:rFonts w:ascii="Times New Roman" w:hAnsi="Times New Roman"/>
-          <w:sz w:val="24"/>
-          <w:szCs w:val="24"/>
-        </w:rPr>
-      </w:pPr>
-    </w:p>
-    <w:p>
-      <w:pPr>
-        <w:spacing w:after="0" w:line="480" w:lineRule="auto"/>
-        <w:rPr>
-          <w:rFonts w:ascii="Times New Roman" w:hAnsi="Times New Roman"/>
-          <w:sz w:val="24"/>
-          <w:szCs w:val="24"/>
-        </w:rPr>
-      </w:pPr>
-    </w:p>
-    <w:p>
-      <w:pPr>
-        <w:spacing w:after="0" w:line="480" w:lineRule="auto"/>
-        <w:rPr>
-          <w:rFonts w:ascii="Times New Roman" w:hAnsi="Times New Roman"/>
-          <w:sz w:val="24"/>
-          <w:szCs w:val="24"/>
-        </w:rPr>
-      </w:pPr>
-    </w:p>
-    <w:p>
-      <w:pPr>
-        <w:spacing w:after="0" w:line="480" w:lineRule="auto"/>
-        <w:rPr>
-          <w:rFonts w:ascii="Times New Roman" w:hAnsi="Times New Roman"/>
-          <w:sz w:val="24"/>
-          <w:szCs w:val="24"/>
-        </w:rPr>
-      </w:pPr>
-    </w:p>
-    <w:p>
-      <w:pPr>
-        <w:spacing w:after="0" w:line="480" w:lineRule="auto"/>
-        <w:rPr>
-          <w:rFonts w:ascii="Times New Roman" w:hAnsi="Times New Roman"/>
-          <w:sz w:val="24"/>
-          <w:szCs w:val="24"/>
-        </w:rPr>
-      </w:pPr>
-    </w:p>
-    <w:p>
-      <w:pPr>
-        <w:spacing w:after="0" w:line="480" w:lineRule="auto"/>
-        <w:rPr>
-          <w:rFonts w:ascii="Times New Roman" w:hAnsi="Times New Roman"/>
-          <w:sz w:val="24"/>
-          <w:szCs w:val="24"/>
-        </w:rPr>
-      </w:pPr>
-    </w:p>
-    <w:p>
-      <w:pPr>
-        <w:spacing w:after="0" w:line="480" w:lineRule="auto"/>
-        <w:rPr>
-          <w:rFonts w:ascii="Times New Roman" w:hAnsi="Times New Roman"/>
-          <w:sz w:val="24"/>
-          <w:szCs w:val="24"/>
-        </w:rPr>
-      </w:pPr>
-    </w:p>
-    <w:p>
-      <w:pPr>
-        <w:spacing w:after="0" w:line="480" w:lineRule="auto"/>
-        <w:rPr>
-          <w:rFonts w:ascii="Times New Roman" w:hAnsi="Times New Roman"/>
-          <w:sz w:val="24"/>
-          <w:szCs w:val="24"/>
-        </w:rPr>
-      </w:pPr>
-    </w:p>
-    <w:p>
-      <w:pPr>
-        <w:spacing w:after="0" w:line="480" w:lineRule="auto"/>
-        <w:rPr>
-          <w:rFonts w:ascii="Times New Roman" w:hAnsi="Times New Roman"/>
-          <w:sz w:val="24"/>
-          <w:szCs w:val="24"/>
-        </w:rPr>
-      </w:pPr>
-    </w:p>
-    <w:p>
-      <w:pPr>
-        <w:spacing w:after="0" w:line="480" w:lineRule="auto"/>
-        <w:rPr>
-          <w:rFonts w:ascii="Times New Roman" w:hAnsi="Times New Roman"/>
-          <w:sz w:val="24"/>
-          <w:szCs w:val="24"/>
-        </w:rPr>
-      </w:pPr>
-    </w:p>
-    <w:p>
-      <w:pPr>
-        <w:spacing w:after="0" w:line="480" w:lineRule="auto"/>
-        <w:rPr>
-          <w:rFonts w:ascii="Times New Roman" w:hAnsi="Times New Roman"/>
-          <w:sz w:val="24"/>
-          <w:szCs w:val="24"/>
-        </w:rPr>
-      </w:pPr>
-    </w:p>
-    <w:p>
-      <w:pPr>
-        <w:spacing w:after="0" w:line="480" w:lineRule="auto"/>
-        <w:rPr>
-          <w:rFonts w:ascii="Times New Roman" w:hAnsi="Times New Roman"/>
-          <w:sz w:val="24"/>
-          <w:szCs w:val="24"/>
-        </w:rPr>
-      </w:pPr>
-    </w:p>
-    <w:p>
-      <w:pPr>
-        <w:spacing w:after="0" w:line="480" w:lineRule="auto"/>
-        <w:rPr>
-          <w:rFonts w:ascii="Times New Roman" w:hAnsi="Times New Roman"/>
-          <w:sz w:val="24"/>
-          <w:szCs w:val="24"/>
-        </w:rPr>
-      </w:pPr>
-    </w:p>
-    <w:p>
-      <w:pPr>
-        <w:spacing w:after="0" w:line="480" w:lineRule="auto"/>
-        <w:rPr>
-          <w:rFonts w:ascii="Times New Roman" w:hAnsi="Times New Roman"/>
-          <w:sz w:val="24"/>
-          <w:szCs w:val="24"/>
-        </w:rPr>
-      </w:pPr>
-    </w:p>
-    <w:p>
-      <w:pPr>
-        <w:spacing w:after="0" w:line="480" w:lineRule="auto"/>
-        <w:rPr>
-          <w:rFonts w:ascii="Times New Roman" w:hAnsi="Times New Roman"/>
-          <w:sz w:val="24"/>
-          <w:szCs w:val="24"/>
-        </w:rPr>
-      </w:pPr>
-    </w:p>
-    <w:p>
-      <w:pPr>
-        <w:spacing w:after="0" w:line="480" w:lineRule="auto"/>
-        <w:rPr>
-          <w:rFonts w:ascii="Times New Roman" w:hAnsi="Times New Roman"/>
-          <w:sz w:val="24"/>
-          <w:szCs w:val="24"/>
-        </w:rPr>
-      </w:pPr>
-    </w:p>
-    <w:p>
-      <w:pPr>
-        <w:spacing w:after="0" w:line="480" w:lineRule="auto"/>
-        <w:rPr>
-          <w:rFonts w:ascii="Times New Roman" w:hAnsi="Times New Roman"/>
-          <w:sz w:val="24"/>
-          <w:szCs w:val="24"/>
-        </w:rPr>
-      </w:pPr>
-    </w:p>
-    <w:p>
-      <w:pPr>
-        <w:spacing w:after="0" w:line="480" w:lineRule="auto"/>
-        <w:rPr>
-          <w:rFonts w:ascii="Times New Roman" w:hAnsi="Times New Roman"/>
-          <w:sz w:val="24"/>
-          <w:szCs w:val="24"/>
-        </w:rPr>
-      </w:pPr>
     </w:p>
     <w:p>
       <w:pPr>
@@ -3558,282 +2779,6 @@
         </w:tc>
       </w:tr>
     </w:tbl>
-    <w:p>
-      <w:pPr>
-        <w:spacing w:after="0" w:line="480" w:lineRule="auto"/>
-        <w:rPr>
-          <w:rFonts w:ascii="Times New Roman" w:hAnsi="Times New Roman"/>
-          <w:b/>
-          <w:bCs/>
-          <w:sz w:val="24"/>
-          <w:szCs w:val="24"/>
-        </w:rPr>
-      </w:pPr>
-    </w:p>
-    <w:p>
-      <w:pPr>
-        <w:spacing w:after="0" w:line="480" w:lineRule="auto"/>
-        <w:rPr>
-          <w:rFonts w:ascii="Times New Roman" w:hAnsi="Times New Roman"/>
-          <w:b/>
-          <w:bCs/>
-          <w:sz w:val="24"/>
-          <w:szCs w:val="24"/>
-        </w:rPr>
-      </w:pPr>
-    </w:p>
-    <w:p>
-      <w:pPr>
-        <w:spacing w:after="0" w:line="480" w:lineRule="auto"/>
-        <w:rPr>
-          <w:rFonts w:ascii="Times New Roman" w:hAnsi="Times New Roman"/>
-          <w:b/>
-          <w:bCs/>
-          <w:sz w:val="24"/>
-          <w:szCs w:val="24"/>
-        </w:rPr>
-      </w:pPr>
-    </w:p>
-    <w:p>
-      <w:pPr>
-        <w:spacing w:after="0" w:line="480" w:lineRule="auto"/>
-        <w:rPr>
-          <w:rFonts w:ascii="Times New Roman" w:hAnsi="Times New Roman"/>
-          <w:b/>
-          <w:bCs/>
-          <w:sz w:val="24"/>
-          <w:szCs w:val="24"/>
-        </w:rPr>
-      </w:pPr>
-    </w:p>
-    <w:p>
-      <w:pPr>
-        <w:spacing w:after="0" w:line="480" w:lineRule="auto"/>
-        <w:rPr>
-          <w:rFonts w:ascii="Times New Roman" w:hAnsi="Times New Roman"/>
-          <w:b/>
-          <w:bCs/>
-          <w:sz w:val="24"/>
-          <w:szCs w:val="24"/>
-        </w:rPr>
-      </w:pPr>
-    </w:p>
-    <w:p>
-      <w:pPr>
-        <w:spacing w:after="0" w:line="480" w:lineRule="auto"/>
-        <w:rPr>
-          <w:rFonts w:ascii="Times New Roman" w:hAnsi="Times New Roman"/>
-          <w:b/>
-          <w:bCs/>
-          <w:sz w:val="24"/>
-          <w:szCs w:val="24"/>
-        </w:rPr>
-      </w:pPr>
-    </w:p>
-    <w:p>
-      <w:pPr>
-        <w:spacing w:after="0" w:line="480" w:lineRule="auto"/>
-        <w:rPr>
-          <w:rFonts w:ascii="Times New Roman" w:hAnsi="Times New Roman"/>
-          <w:b/>
-          <w:bCs/>
-          <w:sz w:val="24"/>
-          <w:szCs w:val="24"/>
-        </w:rPr>
-      </w:pPr>
-    </w:p>
-    <w:p>
-      <w:pPr>
-        <w:spacing w:after="0" w:line="480" w:lineRule="auto"/>
-        <w:rPr>
-          <w:rFonts w:ascii="Times New Roman" w:hAnsi="Times New Roman"/>
-          <w:b/>
-          <w:bCs/>
-          <w:sz w:val="24"/>
-          <w:szCs w:val="24"/>
-        </w:rPr>
-      </w:pPr>
-    </w:p>
-    <w:p>
-      <w:pPr>
-        <w:spacing w:after="0" w:line="480" w:lineRule="auto"/>
-        <w:rPr>
-          <w:rFonts w:ascii="Times New Roman" w:hAnsi="Times New Roman"/>
-          <w:b/>
-          <w:bCs/>
-          <w:sz w:val="24"/>
-          <w:szCs w:val="24"/>
-        </w:rPr>
-      </w:pPr>
-    </w:p>
-    <w:p>
-      <w:pPr>
-        <w:spacing w:after="0" w:line="480" w:lineRule="auto"/>
-        <w:rPr>
-          <w:rFonts w:ascii="Times New Roman" w:hAnsi="Times New Roman"/>
-          <w:b/>
-          <w:bCs/>
-          <w:sz w:val="24"/>
-          <w:szCs w:val="24"/>
-        </w:rPr>
-      </w:pPr>
-    </w:p>
-    <w:p>
-      <w:pPr>
-        <w:spacing w:after="0" w:line="480" w:lineRule="auto"/>
-        <w:rPr>
-          <w:rFonts w:ascii="Times New Roman" w:hAnsi="Times New Roman"/>
-          <w:b/>
-          <w:bCs/>
-          <w:sz w:val="24"/>
-          <w:szCs w:val="24"/>
-        </w:rPr>
-      </w:pPr>
-    </w:p>
-    <w:p>
-      <w:pPr>
-        <w:spacing w:after="0" w:line="480" w:lineRule="auto"/>
-        <w:rPr>
-          <w:rFonts w:ascii="Times New Roman" w:hAnsi="Times New Roman"/>
-          <w:b/>
-          <w:bCs/>
-          <w:sz w:val="24"/>
-          <w:szCs w:val="24"/>
-        </w:rPr>
-      </w:pPr>
-    </w:p>
-    <w:p>
-      <w:pPr>
-        <w:spacing w:after="0" w:line="480" w:lineRule="auto"/>
-        <w:rPr>
-          <w:rFonts w:ascii="Times New Roman" w:hAnsi="Times New Roman"/>
-          <w:b/>
-          <w:bCs/>
-          <w:sz w:val="24"/>
-          <w:szCs w:val="24"/>
-        </w:rPr>
-      </w:pPr>
-    </w:p>
-    <w:p>
-      <w:pPr>
-        <w:spacing w:after="0" w:line="480" w:lineRule="auto"/>
-        <w:rPr>
-          <w:rFonts w:ascii="Times New Roman" w:hAnsi="Times New Roman"/>
-          <w:b/>
-          <w:bCs/>
-          <w:sz w:val="24"/>
-          <w:szCs w:val="24"/>
-        </w:rPr>
-      </w:pPr>
-    </w:p>
-    <w:p>
-      <w:pPr>
-        <w:spacing w:after="0" w:line="480" w:lineRule="auto"/>
-        <w:rPr>
-          <w:rFonts w:ascii="Times New Roman" w:hAnsi="Times New Roman"/>
-          <w:b/>
-          <w:bCs/>
-          <w:sz w:val="24"/>
-          <w:szCs w:val="24"/>
-        </w:rPr>
-      </w:pPr>
-    </w:p>
-    <w:p>
-      <w:pPr>
-        <w:spacing w:after="0" w:line="480" w:lineRule="auto"/>
-        <w:rPr>
-          <w:rFonts w:ascii="Times New Roman" w:hAnsi="Times New Roman"/>
-          <w:b/>
-          <w:bCs/>
-          <w:sz w:val="24"/>
-          <w:szCs w:val="24"/>
-        </w:rPr>
-      </w:pPr>
-    </w:p>
-    <w:p>
-      <w:pPr>
-        <w:spacing w:after="0" w:line="480" w:lineRule="auto"/>
-        <w:rPr>
-          <w:rFonts w:ascii="Times New Roman" w:hAnsi="Times New Roman"/>
-          <w:b/>
-          <w:bCs/>
-          <w:sz w:val="24"/>
-          <w:szCs w:val="24"/>
-        </w:rPr>
-      </w:pPr>
-    </w:p>
-    <w:p>
-      <w:pPr>
-        <w:spacing w:after="0" w:line="480" w:lineRule="auto"/>
-        <w:rPr>
-          <w:rFonts w:ascii="Times New Roman" w:hAnsi="Times New Roman"/>
-          <w:b/>
-          <w:bCs/>
-          <w:sz w:val="24"/>
-          <w:szCs w:val="24"/>
-        </w:rPr>
-      </w:pPr>
-    </w:p>
-    <w:p>
-      <w:pPr>
-        <w:spacing w:after="0" w:line="480" w:lineRule="auto"/>
-        <w:rPr>
-          <w:rFonts w:ascii="Times New Roman" w:hAnsi="Times New Roman"/>
-          <w:b/>
-          <w:bCs/>
-          <w:sz w:val="24"/>
-          <w:szCs w:val="24"/>
-        </w:rPr>
-      </w:pPr>
-    </w:p>
-    <w:p>
-      <w:pPr>
-        <w:spacing w:after="0" w:line="480" w:lineRule="auto"/>
-        <w:rPr>
-          <w:rFonts w:ascii="Times New Roman" w:hAnsi="Times New Roman"/>
-          <w:b/>
-          <w:bCs/>
-          <w:sz w:val="24"/>
-          <w:szCs w:val="24"/>
-        </w:rPr>
-      </w:pPr>
-    </w:p>
-    <w:p>
-      <w:pPr>
-        <w:spacing w:after="0" w:line="480" w:lineRule="auto"/>
-        <w:rPr>
-          <w:rFonts w:ascii="Times New Roman" w:hAnsi="Times New Roman"/>
-          <w:b/>
-          <w:bCs/>
-          <w:sz w:val="24"/>
-          <w:szCs w:val="24"/>
-        </w:rPr>
-      </w:pPr>
-    </w:p>
-    <w:p>
-      <w:pPr>
-        <w:spacing w:after="0" w:line="480" w:lineRule="auto"/>
-        <w:rPr>
-          <w:rFonts w:ascii="Times New Roman" w:hAnsi="Times New Roman"/>
-          <w:b/>
-          <w:bCs/>
-          <w:sz w:val="24"/>
-          <w:szCs w:val="24"/>
-        </w:rPr>
-      </w:pPr>
-    </w:p>
-    <w:p>
-      <w:pPr>
-        <w:spacing w:after="0" w:line="240" w:lineRule="auto"/>
-        <w:rPr>
-          <w:rFonts w:ascii="Times New Roman" w:hAnsi="Times New Roman"/>
-          <w:b/>
-          <w:bCs/>
-          <w:sz w:val="24"/>
-          <w:szCs w:val="24"/>
-        </w:rPr>
-      </w:pPr>
-    </w:p>
     <w:p>
       <w:pPr>
         <w:spacing w:after="0" w:line="240" w:lineRule="auto"/>

</xml_diff>